<commit_message>
override s3 bucket file
</commit_message>
<xml_diff>
--- a/CloudPi_05_AWS_Integration.docx
+++ b/CloudPi_05_AWS_Integration.docx
@@ -184,23 +184,7 @@
           <w:iCs/>
           <w:sz w:val="24"/>
         </w:rPr>
-        <w:t xml:space="preserve"> </w:t>
-      </w:r>
-      <w:proofErr w:type="spellStart"/>
-      <w:r>
-        <w:rPr>
-          <w:iCs/>
-          <w:sz w:val="24"/>
-        </w:rPr>
-        <w:t>teselect</w:t>
-      </w:r>
-      <w:proofErr w:type="spellEnd"/>
-      <w:r>
-        <w:rPr>
-          <w:iCs/>
-          <w:sz w:val="24"/>
-        </w:rPr>
-        <w:t xml:space="preserve"> standard data export </w:t>
+        <w:t xml:space="preserve"> select standard data export </w:t>
       </w:r>
       <w:r>
         <w:rPr>
@@ -300,6 +284,36 @@
           <w:szCs w:val="21"/>
           <w:shd w:val="clear" w:color="auto" w:fill="FFFFFF"/>
         </w:rPr>
+        <w:t>Overwrite existing data export file</w:t>
+      </w:r>
+      <w:r>
+        <w:rPr>
+          <w:rFonts w:ascii="Helvetica Neue" w:hAnsi="Helvetica Neue"/>
+          <w:color w:val="0F141A"/>
+          <w:sz w:val="21"/>
+          <w:szCs w:val="21"/>
+          <w:shd w:val="clear" w:color="auto" w:fill="FFFFFF"/>
+        </w:rPr>
+        <w:t xml:space="preserve"> </w:t>
+      </w:r>
+      <w:r>
+        <w:rPr>
+          <w:rFonts w:ascii="Helvetica Neue" w:hAnsi="Helvetica Neue"/>
+          <w:color w:val="0F141A"/>
+          <w:sz w:val="21"/>
+          <w:szCs w:val="21"/>
+          <w:shd w:val="clear" w:color="auto" w:fill="FFFFFF"/>
+        </w:rPr>
+        <w:sym w:font="Wingdings" w:char="F0E0"/>
+      </w:r>
+      <w:r>
+        <w:rPr>
+          <w:rFonts w:ascii="Helvetica Neue" w:hAnsi="Helvetica Neue"/>
+          <w:color w:val="0F141A"/>
+          <w:sz w:val="21"/>
+          <w:szCs w:val="21"/>
+          <w:shd w:val="clear" w:color="auto" w:fill="FFFFFF"/>
+        </w:rPr>
         <w:t>Create new data export file</w:t>
       </w:r>
     </w:p>
@@ -610,16 +624,7 @@
     </w:p>
     <w:p>
       <w:r>
-        <w:t xml:space="preserve">Select Scan now (optional) -- </w:t>
-      </w:r>
-      <w:r>
-        <w:t>CloudPi ingests the</w:t>
-      </w:r>
-      <w:r>
-        <w:t xml:space="preserve"> historic</w:t>
-      </w:r>
-      <w:r>
-        <w:t xml:space="preserve"> selected files. </w:t>
+        <w:t xml:space="preserve">Select Scan now (optional) -- CloudPi ingests the historic selected files. </w:t>
       </w:r>
     </w:p>
     <w:p>
@@ -632,13 +637,7 @@
       </w:r>
       <w:proofErr w:type="spellEnd"/>
       <w:r>
-        <w:t xml:space="preserve"> periodically (as configured, default is once a day) </w:t>
-      </w:r>
-      <w:r>
-        <w:t xml:space="preserve">connects to the s3 bucket </w:t>
-      </w:r>
-      <w:r>
-        <w:t xml:space="preserve">and downloads all the new billing data files. </w:t>
+        <w:t xml:space="preserve"> periodically (as configured, default is once a day) connects to the s3 bucket and downloads all the new billing data files. </w:t>
       </w:r>
     </w:p>
     <w:p>

</xml_diff>